<commit_message>
Viết lại bản sửa mục 3.5 và 4.4 theo văn phong báo cáo
Ba điểm lệch so với bản gốc, đã sửa:
- chủ ngữ: chuyển sang "Nhóm" như các mục khác của báo cáo
- bỏ hết in đậm giữa câu; bản gốc chỉ in đậm ở tiêu đề mục và hàng đầu bảng
- bỏ các nhãn a) b) c) và lối bình luận, chuyển thành câu thuật

Số liệu và sáu bảng giữ nguyên.

Co-Authored-By: Claude Opus 5 <noreply@anthropic.com>
</commit_message>
<xml_diff>
--- a/docs/bao-cao/Sua-muc-3.5-va-4.4.docx
+++ b/docs/bao-cao/Sua-muc-3.5-va-4.4.docx
@@ -45,7 +45,7 @@
           <w:i w:val="0"/>
           <w:sz w:val="26"/>
         </w:rPr>
-        <w:t>Lý do sửa: cả hai mục được viết khi chưa đo được giá trị thông tin của Bộ A và Bộ B. Mục 3.5 vì vậy chỉ nói về thuộc tính ngữ nghĩa, còn mục 4.4 chỉ đối chiếu hai phương pháp. Nay bảng Fisher đã có nên hai mục này cần thay bằng nội dung dưới đây; tiêu đề cũng đổi theo.</w:t>
+        <w:t>Hai mục này được viết khi nhóm chưa đo được giá trị thông tin của Bộ A và Bộ B, nên mục 3.5 chỉ trình bày thuộc tính ngữ nghĩa và mục 4.4 chỉ đối chiếu hai phương pháp. Bảng Fisher nay đã có, vì vậy nội dung và tiêu đề của cả hai mục được thay bằng phần dưới đây.</w:t>
       </w:r>
     </w:p>
     <w:p>
@@ -81,61 +81,7 @@
           <w:i w:val="0"/>
           <w:sz w:val="26"/>
         </w:rPr>
-        <w:t xml:space="preserve">Ba bộ đặc trưng chứa ba loại dữ liệu khác nhau nên phải đo bằng hai dụng cụ khác nhau. Bộ C là thuộc tính định danh, đo bằng </w:t>
-      </w:r>
-      <w:r>
-        <w:rPr>
-          <w:rFonts w:ascii="Times New Roman" w:hAnsi="Times New Roman" w:cs="Times New Roman"/>
-          <w:b/>
-          <w:i w:val="0"/>
-          <w:sz w:val="26"/>
-        </w:rPr>
-        <w:t>entropy</w:t>
-      </w:r>
-      <w:r>
-        <w:rPr>
-          <w:rFonts w:ascii="Times New Roman" w:hAnsi="Times New Roman" w:cs="Times New Roman"/>
-          <w:b w:val="0"/>
-          <w:i w:val="0"/>
-          <w:sz w:val="26"/>
-        </w:rPr>
-        <w:t xml:space="preserve">. Bộ A và Bộ B là số thực, đo bằng </w:t>
-      </w:r>
-      <w:r>
-        <w:rPr>
-          <w:rFonts w:ascii="Times New Roman" w:hAnsi="Times New Roman" w:cs="Times New Roman"/>
-          <w:b/>
-          <w:i w:val="0"/>
-          <w:sz w:val="26"/>
-        </w:rPr>
-        <w:t>phân rã phương sai Fisher</w:t>
-      </w:r>
-      <w:r>
-        <w:rPr>
-          <w:rFonts w:ascii="Times New Roman" w:hAnsi="Times New Roman" w:cs="Times New Roman"/>
-          <w:b w:val="0"/>
-          <w:i w:val="0"/>
-          <w:sz w:val="26"/>
-        </w:rPr>
-        <w:t xml:space="preserve">. Mọi phép tính trong mục này chạy trên </w:t>
-      </w:r>
-      <w:r>
-        <w:rPr>
-          <w:rFonts w:ascii="Times New Roman" w:hAnsi="Times New Roman" w:cs="Times New Roman"/>
-          <w:b/>
-          <w:i w:val="0"/>
-          <w:sz w:val="26"/>
-        </w:rPr>
-        <w:t>mẫu cân bằng 19 ảnh mỗi loài</w:t>
-      </w:r>
-      <w:r>
-        <w:rPr>
-          <w:rFonts w:ascii="Times New Roman" w:hAnsi="Times New Roman" w:cs="Times New Roman"/>
-          <w:b w:val="0"/>
-          <w:i w:val="0"/>
-          <w:sz w:val="26"/>
-        </w:rPr>
-        <w:t xml:space="preserve"> (380 ảnh, bằng cỡ lớp nhỏ nhất là cá lóc); nếu để nguyên 162 ảnh cá dĩa cạnh 19 ảnh cá lóc thì phương sai liên lớp phản ánh kích thước lớp nhiều hơn phản ánh khác biệt loài.</w:t>
+        <w:t>Ba bộ đặc trưng chứa ba loại dữ liệu khác nhau nên nhóm dùng hai dụng cụ đo khác nhau: entropy cho Bộ C vì đó là thuộc tính định danh, và phân rã phương sai Fisher cho Bộ A và Bộ B vì đó là số thực. Mọi phép tính trong mục này chạy trên mẫu cân bằng 19 ảnh mỗi loài, tức 380 ảnh, bằng cỡ lớp nhỏ nhất là cá lóc. Nếu để nguyên 162 ảnh cá dĩa cạnh 19 ảnh cá lóc thì phương sai liên lớp phản ánh kích thước lớp nhiều hơn phản ánh khác biệt giữa các loài.</w:t>
       </w:r>
     </w:p>
     <w:p>
@@ -147,20 +93,11 @@
       <w:r>
         <w:rPr>
           <w:rFonts w:ascii="Times New Roman" w:hAnsi="Times New Roman" w:cs="Times New Roman"/>
-          <w:b/>
-          <w:i w:val="0"/>
-          <w:sz w:val="26"/>
-        </w:rPr>
-        <w:t>a) Bộ C — đo bằng entropy.</w:t>
-      </w:r>
-      <w:r>
-        <w:rPr>
-          <w:rFonts w:ascii="Times New Roman" w:hAnsi="Times New Roman" w:cs="Times New Roman"/>
           <w:b w:val="0"/>
           <w:i w:val="0"/>
           <w:sz w:val="26"/>
         </w:rPr>
-        <w:t xml:space="preserve"> Với 20 loài có 190 cặp loài, entropy tối đa lý thuyết là log₂20 = 4,32 bit. Kết quả đo trên bảng thuộc tính:</w:t>
+        <w:t>Với Bộ C, 20 loài cho 190 cặp loài và entropy tối đa lý thuyết là log₂20 = 4,32 bit. Kết quả đo trên bảng thuộc tính:</w:t>
       </w:r>
     </w:p>
     <w:p>
@@ -1171,7 +1108,7 @@
           <w:i w:val="0"/>
           <w:sz w:val="26"/>
         </w:rPr>
-        <w:t>Không thuộc tính nào đạt 4,32 bit (cao nhất là 2,65), nên không đặc trưng đơn lẻ nào phân loại nổi 20 loài. Đây là lập luận định lượng cho kiến trúc nhiều bộ đặc trưng.</w:t>
+        <w:t>Không thuộc tính nào đạt 4,32 bit, cao nhất là 2,65, nên không đặc trưng đơn lẻ nào phân loại nổi 20 loài. Đây là lập luận định lượng cho kiến trúc nhiều bộ đặc trưng.</w:t>
       </w:r>
     </w:p>
     <w:p>
@@ -1245,68 +1182,7 @@
           <w:i w:val="0"/>
           <w:sz w:val="26"/>
         </w:rPr>
-        <w:t>Có những phân biệt thị giác mà thuộc tính ngữ nghĩa không biểu diễn được (như số khoang trắng của cá hề). Khoảng trống này là lý do tồn tại của Bộ A và Bộ B.</w:t>
-      </w:r>
-    </w:p>
-    <w:p>
-      <w:pPr>
-        <w:spacing w:line="360" w:lineRule="auto" w:after="0"/>
-        <w:ind w:firstLine="500"/>
-        <w:jc w:val="both"/>
-      </w:pPr>
-      <w:r>
-        <w:rPr>
-          <w:rFonts w:ascii="Times New Roman" w:hAnsi="Times New Roman" w:cs="Times New Roman"/>
-          <w:b/>
-          <w:i w:val="0"/>
-          <w:sz w:val="26"/>
-        </w:rPr>
-        <w:t>b) Bộ A và Bộ B — đo bằng Fisher score.</w:t>
-      </w:r>
-      <w:r>
-        <w:rPr>
-          <w:rFonts w:ascii="Times New Roman" w:hAnsi="Times New Roman" w:cs="Times New Roman"/>
-          <w:b w:val="0"/>
-          <w:i w:val="0"/>
-          <w:sz w:val="26"/>
-        </w:rPr>
-        <w:t xml:space="preserve"> Phép đo tách phương sai của mỗi chiều thành hai phần: </w:t>
-      </w:r>
-      <w:r>
-        <w:rPr>
-          <w:rFonts w:ascii="Times New Roman" w:hAnsi="Times New Roman" w:cs="Times New Roman"/>
-          <w:b/>
-          <w:i w:val="0"/>
-          <w:sz w:val="26"/>
-        </w:rPr>
-        <w:t>phương sai nội lớp</w:t>
-      </w:r>
-      <w:r>
-        <w:rPr>
-          <w:rFonts w:ascii="Times New Roman" w:hAnsi="Times New Roman" w:cs="Times New Roman"/>
-          <w:b w:val="0"/>
-          <w:i w:val="0"/>
-          <w:sz w:val="26"/>
-        </w:rPr>
-        <w:t xml:space="preserve"> (ảnh cùng loài lệch nhau bao nhiêu) và </w:t>
-      </w:r>
-      <w:r>
-        <w:rPr>
-          <w:rFonts w:ascii="Times New Roman" w:hAnsi="Times New Roman" w:cs="Times New Roman"/>
-          <w:b/>
-          <w:i w:val="0"/>
-          <w:sz w:val="26"/>
-        </w:rPr>
-        <w:t>phương sai liên lớp</w:t>
-      </w:r>
-      <w:r>
-        <w:rPr>
-          <w:rFonts w:ascii="Times New Roman" w:hAnsi="Times New Roman" w:cs="Times New Roman"/>
-          <w:b w:val="0"/>
-          <w:i w:val="0"/>
-          <w:sz w:val="26"/>
-        </w:rPr>
-        <w:t xml:space="preserve"> (các loài lệch nhau bao nhiêu). Tỉ số liên lớp chia nội lớp là Fisher score; tỉ số từ 1 trở lên nghĩa là chiều đó tách loài mạnh hơn nhiễu trong loài.</w:t>
+        <w:t>Có những phân biệt thị giác mà thuộc tính ngữ nghĩa không biểu diễn được, như số khoang trắng của cá hề. Khoảng trống này là lý do tồn tại của Bộ A và Bộ B.</w:t>
       </w:r>
     </w:p>
     <w:p>
@@ -1322,17 +1198,15 @@
           <w:i w:val="0"/>
           <w:sz w:val="26"/>
         </w:rPr>
-        <w:t xml:space="preserve">Để so được giữa hai khối có số chiều khác nhau, nhóm dùng thêm </w:t>
+        <w:t>Với Bộ A và Bộ B, nhóm phân rã phương sai của mỗi chiều thành hai phần: phương sai nội lớp đo mức lệch giữa các ảnh cùng loài, phương sai liên lớp đo mức lệch giữa các loài. Tỉ số liên lớp chia nội lớp là Fisher score; tỉ số từ 1 trở lên nghĩa là chiều đó tách loài mạnh hơn nhiễu trong loài.</w:t>
       </w:r>
-      <w:r>
-        <w:rPr>
-          <w:rFonts w:ascii="Times New Roman" w:hAnsi="Times New Roman" w:cs="Times New Roman"/>
-          <w:b/>
-          <w:i w:val="0"/>
-          <w:sz w:val="26"/>
-        </w:rPr>
-        <w:t>η² = liên lớp / (liên lớp + nội lớp)</w:t>
-      </w:r>
+    </w:p>
+    <w:p>
+      <w:pPr>
+        <w:spacing w:line="360" w:lineRule="auto" w:after="0"/>
+        <w:ind w:firstLine="500"/>
+        <w:jc w:val="both"/>
+      </w:pPr>
       <w:r>
         <w:rPr>
           <w:rFonts w:ascii="Times New Roman" w:hAnsi="Times New Roman" w:cs="Times New Roman"/>
@@ -1340,25 +1214,7 @@
           <w:i w:val="0"/>
           <w:sz w:val="26"/>
         </w:rPr>
-        <w:t xml:space="preserve">, nằm trong khoảng [0; 1] và </w:t>
-      </w:r>
-      <w:r>
-        <w:rPr>
-          <w:rFonts w:ascii="Times New Roman" w:hAnsi="Times New Roman" w:cs="Times New Roman"/>
-          <w:b/>
-          <w:i w:val="0"/>
-          <w:sz w:val="26"/>
-        </w:rPr>
-        <w:t>bất biến thang đo</w:t>
-      </w:r>
-      <w:r>
-        <w:rPr>
-          <w:rFonts w:ascii="Times New Roman" w:hAnsi="Times New Roman" w:cs="Times New Roman"/>
-          <w:b w:val="0"/>
-          <w:i w:val="0"/>
-          <w:sz w:val="26"/>
-        </w:rPr>
-        <w:t>. Bất biến thang đo là điều kiện bắt buộc ở đây: Bộ A</w:t>
+        <w:t>Để so sánh được giữa hai khối có số chiều khác nhau, nhóm dùng thêm đại lượng η² bằng phương sai liên lớp chia tổng hai phương sai. Đại lượng này nằm trong khoảng [0; 1] và bất biến thang đo. Tính bất biến thang đo là điều kiện bắt buộc ở đây vì Bộ A</w:t>
       </w:r>
       <w:r>
         <w:rPr>
@@ -1376,7 +1232,7 @@
           <w:i w:val="0"/>
           <w:sz w:val="26"/>
         </w:rPr>
-        <w:t xml:space="preserve"> trộn kênh L trong [0; 100] với hai kênh a, b trong [−128; 127], nên một thước đo phụ thuộc thang đo sẽ cho kết quả sai lệch.</w:t>
+        <w:t xml:space="preserve"> trộn kênh L trong khoảng [0; 100] với hai kênh a và b trong khoảng [−128; 127].</w:t>
       </w:r>
     </w:p>
     <w:p>
@@ -2527,66 +2383,11 @@
       <w:r>
         <w:rPr>
           <w:rFonts w:ascii="Times New Roman" w:hAnsi="Times New Roman" w:cs="Times New Roman"/>
-          <w:b/>
-          <w:i w:val="0"/>
-          <w:sz w:val="26"/>
-        </w:rPr>
-        <w:t>Độ lệch chuẩn màu mạnh hơn màu trung bình.</w:t>
-      </w:r>
-      <w:r>
-        <w:rPr>
-          <w:rFonts w:ascii="Times New Roman" w:hAnsi="Times New Roman" w:cs="Times New Roman"/>
           <w:b w:val="0"/>
           <w:i w:val="0"/>
           <w:sz w:val="26"/>
         </w:rPr>
-        <w:t xml:space="preserve"> Hai chiều dẫn đầu là lech_b (2,32) và lech_a (1,99), đều là độ lệch chuẩn; chiều màu trung bình mạnh nhất là tb_b chỉ đạt 1,36. Nói cách khác, “màu có đồng đều hay không” tách loài tốt hơn “màu gì”.</w:t>
-      </w:r>
-    </w:p>
-    <w:p>
-      <w:pPr>
-        <w:tabs>
-          <w:tab w:pos="418" w:val="left"/>
-        </w:tabs>
-        <w:spacing w:line="360" w:lineRule="auto" w:after="0"/>
-        <w:ind w:left="418" w:hanging="418"/>
-        <w:jc w:val="both"/>
-      </w:pPr>
-      <w:r>
-        <w:rPr>
-          <w:rFonts w:ascii="Arial" w:hAnsi="Arial" w:cs="Arial"/>
-          <w:b w:val="0"/>
-          <w:i w:val="0"/>
-          <w:sz w:val="18"/>
-        </w:rPr>
-        <w:t>−</w:t>
-      </w:r>
-      <w:r>
-        <w:rPr>
-          <w:rFonts w:ascii="Times New Roman" w:hAnsi="Times New Roman" w:cs="Times New Roman"/>
-          <w:b w:val="0"/>
-          <w:i w:val="0"/>
-          <w:sz w:val="26"/>
-        </w:rPr>
-        <w:tab/>
-      </w:r>
-      <w:r>
-        <w:rPr>
-          <w:rFonts w:ascii="Times New Roman" w:hAnsi="Times New Roman" w:cs="Times New Roman"/>
-          <w:b/>
-          <w:i w:val="0"/>
-          <w:sz w:val="26"/>
-        </w:rPr>
-        <w:t>Cả ba chiều của kênh độ sáng L đều xếp gần cuối</w:t>
-      </w:r>
-      <w:r>
-        <w:rPr>
-          <w:rFonts w:ascii="Times New Roman" w:hAnsi="Times New Roman" w:cs="Times New Roman"/>
-          <w:b w:val="0"/>
-          <w:i w:val="0"/>
-          <w:sz w:val="26"/>
-        </w:rPr>
-        <w:t xml:space="preserve"> (tb_L 0,34; lech_L 0,33; xien_L 0,25). Ảnh được chụp ở những điều kiện sáng khác nhau nên L biến động trong cùng một loài nhiều hơn là giữa các loài. Đây là bằng chứng định lượng cho việc chọn hệ màu Lab và tách độ sáng ra khỏi màu, thay vì chỉ là lập luận thiết kế.</w:t>
+        <w:t>Hai chiều dẫn đầu là lech_b với 2,32 và lech_a với 1,99, đều là độ lệch chuẩn, trong khi chiều màu trung bình mạnh nhất là tb_b chỉ đạt 1,36. Mức đồng đều của màu tách loài tốt hơn giá trị màu trung bình.</w:t>
       </w:r>
     </w:p>
     <w:p>
@@ -2623,7 +2424,44 @@
           <w:i w:val="0"/>
           <w:sz w:val="26"/>
         </w:rPr>
-        <w:t>Chỉ 3 trong 9 chiều đạt Fisher score từ 1 trở lên, cho thấy 9 chiều color moments là một khối nhỏ và nông — phù hợp với vai trò đối chứng cơ sở của nó.</w:t>
+        <w:t>Cả ba chiều của kênh độ sáng L đều xếp gần cuối: tb_L 0,34, lech_L 0,33 và xien_L 0,25. Ảnh được chụp ở những điều kiện sáng khác nhau nên L biến động trong cùng một loài nhiều hơn là giữa các loài. Đây là bằng chứng định lượng cho việc chọn hệ màu Lab và tách độ sáng khỏi màu.</w:t>
+      </w:r>
+    </w:p>
+    <w:p>
+      <w:pPr>
+        <w:tabs>
+          <w:tab w:pos="418" w:val="left"/>
+        </w:tabs>
+        <w:spacing w:line="360" w:lineRule="auto" w:after="0"/>
+        <w:ind w:left="418" w:hanging="418"/>
+        <w:jc w:val="both"/>
+      </w:pPr>
+      <w:r>
+        <w:rPr>
+          <w:rFonts w:ascii="Arial" w:hAnsi="Arial" w:cs="Arial"/>
+          <w:b w:val="0"/>
+          <w:i w:val="0"/>
+          <w:sz w:val="18"/>
+        </w:rPr>
+        <w:t>−</w:t>
+      </w:r>
+      <w:r>
+        <w:rPr>
+          <w:rFonts w:ascii="Times New Roman" w:hAnsi="Times New Roman" w:cs="Times New Roman"/>
+          <w:b w:val="0"/>
+          <w:i w:val="0"/>
+          <w:sz w:val="26"/>
+        </w:rPr>
+        <w:tab/>
+      </w:r>
+      <w:r>
+        <w:rPr>
+          <w:rFonts w:ascii="Times New Roman" w:hAnsi="Times New Roman" w:cs="Times New Roman"/>
+          <w:b w:val="0"/>
+          <w:i w:val="0"/>
+          <w:sz w:val="26"/>
+        </w:rPr>
+        <w:t>Chỉ 3 trong 9 chiều đạt Fisher score từ 1 trở lên, phù hợp với vai trò đối chứng cơ sở của khối này.</w:t>
       </w:r>
     </w:p>
     <w:p>
@@ -3223,20 +3061,11 @@
       <w:r>
         <w:rPr>
           <w:rFonts w:ascii="Times New Roman" w:hAnsi="Times New Roman" w:cs="Times New Roman"/>
-          <w:b/>
-          <w:i w:val="0"/>
-          <w:sz w:val="26"/>
-        </w:rPr>
-        <w:t>Cột để so sánh là η² top-9, không phải η² trung bình.</w:t>
-      </w:r>
-      <w:r>
-        <w:rPr>
-          <w:rFonts w:ascii="Times New Roman" w:hAnsi="Times New Roman" w:cs="Times New Roman"/>
           <w:b w:val="0"/>
           <w:i w:val="0"/>
           <w:sz w:val="26"/>
         </w:rPr>
-        <w:t xml:space="preserve"> Lấy trung bình trên toàn bộ 512 chiều làm loãng Bộ B, vì phần lớn chiều của nó không liên quan tới cặp loài đang xét: η² trung bình cho ra 0,366 thấp hơn 0,398 của Bộ A</w:t>
+        <w:t>Cột dùng để so sánh giữa các khối là η² top-9, không phải η² trung bình. Lấy trung bình trên toàn bộ 512 chiều làm loãng Bộ B vì phần lớn chiều của nó không liên quan tới cặp loài đang xét: η² trung bình cho 0,366, thấp hơn 0,398 của Bộ A</w:t>
       </w:r>
       <w:r>
         <w:rPr>
@@ -3254,71 +3083,7 @@
           <w:i w:val="0"/>
           <w:sz w:val="26"/>
         </w:rPr>
-        <w:t xml:space="preserve">, </w:t>
-      </w:r>
-      <w:r>
-        <w:rPr>
-          <w:rFonts w:ascii="Times New Roman" w:hAnsi="Times New Roman" w:cs="Times New Roman"/>
-          <w:b/>
-          <w:i w:val="0"/>
-          <w:sz w:val="26"/>
-        </w:rPr>
-        <w:t>trái ngược hẳn</w:t>
-      </w:r>
-      <w:r>
-        <w:rPr>
-          <w:rFonts w:ascii="Times New Roman" w:hAnsi="Times New Roman" w:cs="Times New Roman"/>
-          <w:b w:val="0"/>
-          <w:i w:val="0"/>
-          <w:sz w:val="26"/>
-        </w:rPr>
-        <w:t xml:space="preserve"> kết quả P@5 thật (72,2% so với 32,2%). So cùng 9 chiều mạnh nhất thì Bộ B đạt 0,681 và khớp với P@5. Đây là một lỗi thước đo mà nhóm phát hiện nhờ đối chiếu với P@5.</w:t>
-      </w:r>
-    </w:p>
-    <w:p>
-      <w:pPr>
-        <w:tabs>
-          <w:tab w:pos="418" w:val="left"/>
-        </w:tabs>
-        <w:spacing w:line="360" w:lineRule="auto" w:after="0"/>
-        <w:ind w:left="418" w:hanging="418"/>
-        <w:jc w:val="both"/>
-      </w:pPr>
-      <w:r>
-        <w:rPr>
-          <w:rFonts w:ascii="Arial" w:hAnsi="Arial" w:cs="Arial"/>
-          <w:b w:val="0"/>
-          <w:i w:val="0"/>
-          <w:sz w:val="18"/>
-        </w:rPr>
-        <w:t>−</w:t>
-      </w:r>
-      <w:r>
-        <w:rPr>
-          <w:rFonts w:ascii="Times New Roman" w:hAnsi="Times New Roman" w:cs="Times New Roman"/>
-          <w:b w:val="0"/>
-          <w:i w:val="0"/>
-          <w:sz w:val="26"/>
-        </w:rPr>
-        <w:tab/>
-      </w:r>
-      <w:r>
-        <w:rPr>
-          <w:rFonts w:ascii="Times New Roman" w:hAnsi="Times New Roman" w:cs="Times New Roman"/>
-          <w:b/>
-          <w:i w:val="0"/>
-          <w:sz w:val="26"/>
-        </w:rPr>
-        <w:t>Con số η² = 1,000 của Bộ C là hệ quả của cách gán, không phải thành tích.</w:t>
-      </w:r>
-      <w:r>
-        <w:rPr>
-          <w:rFonts w:ascii="Times New Roman" w:hAnsi="Times New Roman" w:cs="Times New Roman"/>
-          <w:b w:val="0"/>
-          <w:i w:val="0"/>
-          <w:sz w:val="26"/>
-        </w:rPr>
-        <w:t xml:space="preserve"> Vector Bộ C gán theo loài nên mọi ảnh cùng loài có vector y hệt nhau, phương sai nội lớp bằng 0 và η² bằng 1 theo định nghĩa, bất kể bảng thuộc tính tốt hay dở. Giá trị thông tin thật của Bộ C phải đọc ở bảng entropy, không đọc ở bảng này.</w:t>
+        <w:t>, trái ngược với kết quả P@5 là 72,2% so với 32,2%. So trên cùng 9 chiều mạnh nhất thì Bộ B đạt 0,681 và khớp với P@5. Nhóm phát hiện sai lệch này nhờ đối chiếu với P@5 trước khi đưa bảng vào báo cáo.</w:t>
       </w:r>
     </w:p>
     <w:p>
@@ -3355,16 +3120,26 @@
           <w:i w:val="0"/>
           <w:sz w:val="26"/>
         </w:rPr>
-        <w:t xml:space="preserve">Bộ B có 82/512 chiều đạt Fisher score từ 1 trở lên và </w:t>
+        <w:t>Giá trị η² bằng 1,000 của Bộ C là hệ quả của cách gán vector, không phải thành tích. Vector Bộ C gán theo loài nên mọi ảnh cùng loài có vector như nhau, phương sai nội lớp bằng 0 và η² bằng 1 theo định nghĩa, bất kể bảng thuộc tính tốt hay dở. Giá trị thông tin của Bộ C phải đọc ở bảng entropy.</w:t>
       </w:r>
+    </w:p>
+    <w:p>
+      <w:pPr>
+        <w:tabs>
+          <w:tab w:pos="418" w:val="left"/>
+        </w:tabs>
+        <w:spacing w:line="360" w:lineRule="auto" w:after="0"/>
+        <w:ind w:left="418" w:hanging="418"/>
+        <w:jc w:val="both"/>
+      </w:pPr>
       <w:r>
         <w:rPr>
-          <w:rFonts w:ascii="Times New Roman" w:hAnsi="Times New Roman" w:cs="Times New Roman"/>
-          <w:b/>
+          <w:rFonts w:ascii="Arial" w:hAnsi="Arial" w:cs="Arial"/>
+          <w:b w:val="0"/>
           <w:i w:val="0"/>
-          <w:sz w:val="26"/>
+          <w:sz w:val="18"/>
         </w:rPr>
-        <w:t>0/512 chiều vô dụng</w:t>
+        <w:t>−</w:t>
       </w:r>
       <w:r>
         <w:rPr>
@@ -3373,16 +3148,7 @@
           <w:i w:val="0"/>
           <w:sz w:val="26"/>
         </w:rPr>
-        <w:t xml:space="preserve"> (phân vị tỉ số Fisher: 25% = 0,38; 50% = 0,55; 75% = 0,82; 95% = 1,40). Vì vậy giảm chiều bằng PCA xuống 128 sẽ làm mất thông tin thật chứ không chỉ cắt phần thừa; đánh đổi giữa kích thước chỉ mục và recall sẽ được </w:t>
-      </w:r>
-      <w:r>
-        <w:rPr>
-          <w:rFonts w:ascii="Times New Roman" w:hAnsi="Times New Roman" w:cs="Times New Roman"/>
-          <w:b/>
-          <w:i w:val="0"/>
-          <w:sz w:val="26"/>
-        </w:rPr>
-        <w:t>đo</w:t>
+        <w:tab/>
       </w:r>
       <w:r>
         <w:rPr>
@@ -3391,7 +3157,7 @@
           <w:i w:val="0"/>
           <w:sz w:val="26"/>
         </w:rPr>
-        <w:t xml:space="preserve"> ở giai đoạn 2 thay vì giả định.</w:t>
+        <w:t>Bộ B có 82 trong 512 chiều đạt Fisher score từ 1 trở lên và không có chiều nào vô dụng; phân vị tỉ số Fisher là 0,38 ở mức 25%, 0,55 ở mức 50%, 0,82 ở mức 75% và 1,40 ở mức 95%. Vì vậy giảm chiều bằng PCA xuống 128 sẽ làm mất thông tin thật chứ không chỉ cắt phần thừa; đánh đổi giữa kích thước chỉ mục và recall sẽ được đo ở giai đoạn 2.</w:t>
       </w:r>
     </w:p>
     <w:p>
@@ -3407,7 +3173,7 @@
           <w:i/>
           <w:sz w:val="26"/>
         </w:rPr>
-        <w:t>Bảng 6. Mười hai cặp loài cùng họ — η² top-9 của từng khối (cao nghĩa là tách được)</w:t>
+        <w:t>Bảng 6. Mười hai cặp loài cùng họ — η² top-9 của từng khối, giá trị cao nghĩa là tách được</w:t>
       </w:r>
     </w:p>
     <w:tbl>
@@ -4861,25 +4627,7 @@
           <w:i w:val="0"/>
           <w:sz w:val="26"/>
         </w:rPr>
-        <w:t xml:space="preserve"> ở </w:t>
-      </w:r>
-      <w:r>
-        <w:rPr>
-          <w:rFonts w:ascii="Times New Roman" w:hAnsi="Times New Roman" w:cs="Times New Roman"/>
-          <w:b/>
-          <w:i w:val="0"/>
-          <w:sz w:val="26"/>
-        </w:rPr>
-        <w:t>cả 12/12 cặp</w:t>
-      </w:r>
-      <w:r>
-        <w:rPr>
-          <w:rFonts w:ascii="Times New Roman" w:hAnsi="Times New Roman" w:cs="Times New Roman"/>
-          <w:b w:val="0"/>
-          <w:i w:val="0"/>
-          <w:sz w:val="26"/>
-        </w:rPr>
-        <w:t>, không cặp nào ngoại lệ.</w:t>
+        <w:t xml:space="preserve"> ở cả 12 cặp, không cặp nào ngoại lệ.</w:t>
       </w:r>
     </w:p>
     <w:p>
@@ -4934,25 +4682,7 @@
           <w:i w:val="0"/>
           <w:sz w:val="26"/>
         </w:rPr>
-        <w:t xml:space="preserve"> là </w:t>
-      </w:r>
-      <w:r>
-        <w:rPr>
-          <w:rFonts w:ascii="Times New Roman" w:hAnsi="Times New Roman" w:cs="Times New Roman"/>
-          <w:b/>
-          <w:i w:val="0"/>
-          <w:sz w:val="26"/>
-        </w:rPr>
-        <w:t>AST_OCE / SYM_SPP (0,046)</w:t>
-      </w:r>
-      <w:r>
-        <w:rPr>
-          <w:rFonts w:ascii="Times New Roman" w:hAnsi="Times New Roman" w:cs="Times New Roman"/>
-          <w:b w:val="0"/>
-          <w:i w:val="0"/>
-          <w:sz w:val="26"/>
-        </w:rPr>
-        <w:t xml:space="preserve"> — cá hoàng bảo yến và cá dĩa, cùng dáng dẹt cao và đều nhiều màu, đúng vai trò “cặp dễ nhầm” đã định khi chọn loài ở mục 2.2. Nhưng Bộ B tách được cặp này (0,524), nên nó không phải chỗ khó của cả hệ.</w:t>
+        <w:t xml:space="preserve"> là AST_OCE và SYM_SPP với 0,046. Cá hoàng bảo yến và cá dĩa cùng dáng dẹt cao và đều nhiều màu, đúng vai trò cặp dễ nhầm đã định khi chọn loài ở mục 2.2. Bộ B tách được cặp này với 0,524 nên nó không phải điểm khó của cả hệ.</w:t>
       </w:r>
     </w:p>
     <w:p>
@@ -4989,43 +4719,7 @@
           <w:i w:val="0"/>
           <w:sz w:val="26"/>
         </w:rPr>
-        <w:t xml:space="preserve">Cặp khó với </w:t>
-      </w:r>
-      <w:r>
-        <w:rPr>
-          <w:rFonts w:ascii="Times New Roman" w:hAnsi="Times New Roman" w:cs="Times New Roman"/>
-          <w:b/>
-          <w:i w:val="0"/>
-          <w:sz w:val="26"/>
-        </w:rPr>
-        <w:t>cả hai khối</w:t>
-      </w:r>
-      <w:r>
-        <w:rPr>
-          <w:rFonts w:ascii="Times New Roman" w:hAnsi="Times New Roman" w:cs="Times New Roman"/>
-          <w:b w:val="0"/>
-          <w:i w:val="0"/>
-          <w:sz w:val="26"/>
-        </w:rPr>
-        <w:t xml:space="preserve"> là </w:t>
-      </w:r>
-      <w:r>
-        <w:rPr>
-          <w:rFonts w:ascii="Times New Roman" w:hAnsi="Times New Roman" w:cs="Times New Roman"/>
-          <w:b/>
-          <w:i w:val="0"/>
-          <w:sz w:val="26"/>
-        </w:rPr>
-        <w:t>ORE_MOS / ORE_NIL</w:t>
-      </w:r>
-      <w:r>
-        <w:rPr>
-          <w:rFonts w:ascii="Times New Roman" w:hAnsi="Times New Roman" w:cs="Times New Roman"/>
-          <w:b w:val="0"/>
-          <w:i w:val="0"/>
-          <w:sz w:val="26"/>
-        </w:rPr>
-        <w:t>: 0,069 ở Bộ A</w:t>
+        <w:t>Cặp khó với cả hai khối là ORE_MOS và ORE_NIL, đạt 0,069 ở Bộ A</w:t>
       </w:r>
       <w:r>
         <w:rPr>
@@ -5043,7 +4737,7 @@
           <w:i w:val="0"/>
           <w:sz w:val="26"/>
         </w:rPr>
-        <w:t xml:space="preserve"> và 0,182 ở Bộ B, trong khi cặp thấp thứ hai của Bộ B đạt 0,386 — gấp 2,1 lần. Đây là cặp cùng chi Oreochromis, và cũng là cặp nhầm nhiều nhất trong phân tích lỗi top-1 ở mục 4.5.</w:t>
+        <w:t xml:space="preserve"> và 0,182 ở Bộ B, trong khi cặp thấp thứ hai của Bộ B đạt 0,386, gấp 2,1 lần. Đây là cặp cùng chi Oreochromis và cũng là cặp nhầm nhiều nhất trong phân tích lỗi top-1 ở mục 4.5.</w:t>
       </w:r>
     </w:p>
     <w:p>
@@ -5080,25 +4774,7 @@
           <w:i w:val="0"/>
           <w:sz w:val="26"/>
         </w:rPr>
-        <w:t xml:space="preserve">Cặp được Bộ B cải thiện nhiều nhất là </w:t>
-      </w:r>
-      <w:r>
-        <w:rPr>
-          <w:rFonts w:ascii="Times New Roman" w:hAnsi="Times New Roman" w:cs="Times New Roman"/>
-          <w:b/>
-          <w:i w:val="0"/>
-          <w:sz w:val="26"/>
-        </w:rPr>
-        <w:t>AMP_FRE / AMP_OCE (+0,561)</w:t>
-      </w:r>
-      <w:r>
-        <w:rPr>
-          <w:rFonts w:ascii="Times New Roman" w:hAnsi="Times New Roman" w:cs="Times New Roman"/>
-          <w:b w:val="0"/>
-          <w:i w:val="0"/>
-          <w:sz w:val="26"/>
-        </w:rPr>
-        <w:t xml:space="preserve"> — hai loài cá hề. Điều đáng chú ý là chúng cũng là hai loài có P@5 tăng mạnh nhất trong Bảng 2 (+77 và +67 điểm). Hai dụng cụ đo độc lập cho cùng một thứ hạng.</w:t>
+        <w:t>Cặp được Bộ B cải thiện nhiều nhất là AMP_FRE và AMP_OCE với mức chênh 0,561. Hai loài cá hề này cũng là hai loài có P@5 tăng mạnh nhất trong Bảng 2, tăng 77 và 67 điểm. Hai phép đo độc lập cho cùng một thứ hạng.</w:t>
       </w:r>
     </w:p>
     <w:p>
@@ -5134,25 +4810,7 @@
           <w:i w:val="0"/>
           <w:sz w:val="26"/>
         </w:rPr>
-        <w:t xml:space="preserve">Ba phương pháp dưới đây dùng ba nguồn dữ liệu </w:t>
-      </w:r>
-      <w:r>
-        <w:rPr>
-          <w:rFonts w:ascii="Times New Roman" w:hAnsi="Times New Roman" w:cs="Times New Roman"/>
-          <w:b/>
-          <w:i w:val="0"/>
-          <w:sz w:val="26"/>
-        </w:rPr>
-        <w:t>không chia sẻ với nhau</w:t>
-      </w:r>
-      <w:r>
-        <w:rPr>
-          <w:rFonts w:ascii="Times New Roman" w:hAnsi="Times New Roman" w:cs="Times New Roman"/>
-          <w:b w:val="0"/>
-          <w:i w:val="0"/>
-          <w:sz w:val="26"/>
-        </w:rPr>
-        <w:t>: entropy tính trên bảng thuộc tính do người gán, Fisher score tính trên vector đặc trưng, và P@5 đo trên truy vấn ảnh thật. Vì vậy việc chúng cùng chỉ vào một kết luận là bằng chứng mạnh hơn bất kỳ phương pháp đơn lẻ nào.</w:t>
+        <w:t>Ba phương pháp dưới đây dùng ba nguồn dữ liệu không chia sẻ với nhau: entropy tính trên bảng thuộc tính do người gán, Fisher score tính trên vector đặc trưng, và P@5 đo trên truy vấn ảnh thật. Việc chúng cùng chỉ ra một kết luận là bằng chứng mạnh hơn từng phương pháp riêng lẻ.</w:t>
       </w:r>
     </w:p>
     <w:p>
@@ -5164,20 +4822,11 @@
       <w:r>
         <w:rPr>
           <w:rFonts w:ascii="Times New Roman" w:hAnsi="Times New Roman" w:cs="Times New Roman"/>
-          <w:b/>
-          <w:i w:val="0"/>
-          <w:sz w:val="26"/>
-        </w:rPr>
-        <w:t>a) Entropy đối chiếu P@5.</w:t>
-      </w:r>
-      <w:r>
-        <w:rPr>
-          <w:rFonts w:ascii="Times New Roman" w:hAnsi="Times New Roman" w:cs="Times New Roman"/>
           <w:b w:val="0"/>
           <w:i w:val="0"/>
           <w:sz w:val="26"/>
         </w:rPr>
-        <w:t xml:space="preserve"> Đặt bốn loài yếu nhất và bốn loài mạnh nhất của Bộ A</w:t>
+        <w:t>Đặt bốn loài yếu nhất và bốn loài mạnh nhất của Bộ A</w:t>
       </w:r>
       <w:r>
         <w:rPr>
@@ -5883,7 +5532,7 @@
           <w:i w:val="0"/>
           <w:sz w:val="26"/>
         </w:rPr>
-        <w:t>Bốn loài kém nhất đều có màu nâu, bạc, đen — tức mau_nen không mang thông tin phân biệt; bốn loài tốt nhất đều có màu rực hoặc màu riêng. Entropy tính trên bảng do người gán và P@5 đo trên ảnh thật là hai phương pháp độc lập nhưng cho cùng một kết luận.</w:t>
+        <w:t>Bốn loài kém nhất đều có màu nâu, bạc hoặc đen, tức mau_nen không mang thông tin phân biệt; bốn loài tốt nhất đều có màu rực hoặc màu riêng. Entropy tính trên bảng do người gán và P@5 đo trên ảnh thật là hai phương pháp độc lập nhưng cho cùng một kết luận.</w:t>
       </w:r>
     </w:p>
     <w:p>
@@ -5895,20 +5544,11 @@
       <w:r>
         <w:rPr>
           <w:rFonts w:ascii="Times New Roman" w:hAnsi="Times New Roman" w:cs="Times New Roman"/>
-          <w:b/>
-          <w:i w:val="0"/>
-          <w:sz w:val="26"/>
-        </w:rPr>
-        <w:t>b) Fisher score đối chiếu P@5 và đối chiếu phân tích lỗi.</w:t>
-      </w:r>
-      <w:r>
-        <w:rPr>
-          <w:rFonts w:ascii="Times New Roman" w:hAnsi="Times New Roman" w:cs="Times New Roman"/>
           <w:b w:val="0"/>
           <w:i w:val="0"/>
           <w:sz w:val="26"/>
         </w:rPr>
-        <w:t xml:space="preserve"> Cặp cùng chi Oreochromis được cả ba dụng cụ chỉ ra là chỗ khó nhất:</w:t>
+        <w:t>Cặp cùng chi Oreochromis được cả bốn phép đo chỉ ra là điểm khó nhất của hệ:</w:t>
       </w:r>
     </w:p>
     <w:p>
@@ -5924,7 +5564,7 @@
           <w:i/>
           <w:sz w:val="26"/>
         </w:rPr>
-        <w:t>Bảng 7. Cặp ORE_MOS / ORE_NIL qua bốn phép đo độc lập</w:t>
+        <w:t>Bảng 7. Cặp ORE_MOS và ORE_NIL qua bốn phép đo độc lập</w:t>
       </w:r>
     </w:p>
     <w:tbl>
@@ -6142,7 +5782,7 @@
                 <w:i w:val="0"/>
                 <w:sz w:val="26"/>
               </w:rPr>
-              <w:t>thấp thứ 2 trong 12 cặp</w:t>
+              <w:t>thấp thứ hai trong 12 cặp</w:t>
             </w:r>
           </w:p>
         </w:tc>
@@ -6350,25 +5990,7 @@
           <w:i w:val="0"/>
           <w:sz w:val="26"/>
         </w:rPr>
-        <w:t xml:space="preserve">Bốn phép đo này không dùng chung dữ liệu đầu vào: một đọc bảng thuộc tính do người gán, hai đọc vector đặc trưng, một đọc nhãn dự đoán trên truy vấn thật. Vì vậy kết luận “cặp Oreochromis là chỗ khó nhất của hệ” không phải suy đoán từ một con số lẻ. Hoa văn vạch đứng của cá rô phi vằn là </w:t>
-      </w:r>
-      <w:r>
-        <w:rPr>
-          <w:rFonts w:ascii="Times New Roman" w:hAnsi="Times New Roman" w:cs="Times New Roman"/>
-          <w:b/>
-          <w:i w:val="0"/>
-          <w:sz w:val="26"/>
-        </w:rPr>
-        <w:t>kết cấu</w:t>
-      </w:r>
-      <w:r>
-        <w:rPr>
-          <w:rFonts w:ascii="Times New Roman" w:hAnsi="Times New Roman" w:cs="Times New Roman"/>
-          <w:b w:val="0"/>
-          <w:i w:val="0"/>
-          <w:sz w:val="26"/>
-        </w:rPr>
-        <w:t xml:space="preserve"> chứ không phải màu, nên GLCM (</w:t>
+        <w:t>Bốn phép đo này không dùng chung dữ liệu đầu vào: một phép đọc bảng thuộc tính do người gán, hai phép đọc vector đặc trưng, một phép đọc nhãn dự đoán trên truy vấn thật. Hoa văn vạch đứng của cá rô phi vằn là kết cấu chứ không phải màu, nên GLCM (</w:t>
       </w:r>
       <w:r>
         <w:rPr>
@@ -6404,7 +6026,7 @@
           <w:i w:val="0"/>
           <w:sz w:val="26"/>
         </w:rPr>
-        <w:t>) là hai đặc trưng được kỳ vọng xử lý cặp này ở giai đoạn 2 — và đó là một giả thuyết sẽ được kiểm bằng số, chưa phải kết quả.</w:t>
+        <w:t>) là hai đặc trưng được kỳ vọng xử lý cặp này ở giai đoạn 2. Đây là giả thuyết sẽ được kiểm bằng số, chưa phải kết quả đã đo.</w:t>
       </w:r>
     </w:p>
     <w:p>
@@ -6416,38 +6038,11 @@
       <w:r>
         <w:rPr>
           <w:rFonts w:ascii="Times New Roman" w:hAnsi="Times New Roman" w:cs="Times New Roman"/>
-          <w:b/>
-          <w:i w:val="0"/>
-          <w:sz w:val="26"/>
-        </w:rPr>
-        <w:t>c) Chỗ Bộ B hơn Bộ A</w:t>
-      </w:r>
-      <w:r>
-        <w:rPr>
-          <w:rFonts w:ascii="Cambria Math" w:hAnsi="Cambria Math" w:cs="Cambria Math"/>
-          <w:b/>
-          <w:i w:val="0"/>
-          <w:sz w:val="26"/>
-        </w:rPr>
-        <w:t>①</w:t>
-      </w:r>
-      <w:r>
-        <w:rPr>
-          <w:rFonts w:ascii="Times New Roman" w:hAnsi="Times New Roman" w:cs="Times New Roman"/>
-          <w:b/>
-          <w:i w:val="0"/>
-          <w:sz w:val="26"/>
-        </w:rPr>
-        <w:t xml:space="preserve"> nhiều nhất là chỗ đặc điểm phân biệt không nằm ở màu.</w:t>
-      </w:r>
-      <w:r>
-        <w:rPr>
-          <w:rFonts w:ascii="Times New Roman" w:hAnsi="Times New Roman" w:cs="Times New Roman"/>
           <w:b w:val="0"/>
           <w:i w:val="0"/>
           <w:sz w:val="26"/>
         </w:rPr>
-        <w:t xml:space="preserve"> Cặp cá hề minh họa rõ nhất: Bộ C chỉ tách được bằng 1 trong 10 thuộc tính, η² top-9 của Bộ A</w:t>
+        <w:t>Chênh lệch giữa Bộ B và Bộ A</w:t>
       </w:r>
       <w:r>
         <w:rPr>
@@ -6465,7 +6060,25 @@
           <w:i w:val="0"/>
           <w:sz w:val="26"/>
         </w:rPr>
-        <w:t xml:space="preserve"> là 0,103 còn của Bộ B là 0,665 (chênh +0,561, lớn nhất trong 12 cặp), và P@5 nhảy từ 19% và 25% lên 96% và 91% (tăng +77 và +67 điểm, cũng lớn nhất trong 20 loài). Mạng sâu nhìn thấy đúng đặc điểm phân biệt — số khoang trắng — mà cả từ vựng ngữ nghĩa lẫn đặc trưng màu đều bỏ sót.</w:t>
+        <w:t xml:space="preserve"> lớn nhất ở những cặp mà đặc điểm phân biệt không nằm ở màu. Cặp cá hề minh họa rõ nhất: Bộ C chỉ tách được bằng 1 trong 10 thuộc tính, η² top-9 của Bộ A</w:t>
+      </w:r>
+      <w:r>
+        <w:rPr>
+          <w:rFonts w:ascii="Cambria Math" w:hAnsi="Cambria Math" w:cs="Cambria Math"/>
+          <w:b w:val="0"/>
+          <w:i w:val="0"/>
+          <w:sz w:val="26"/>
+        </w:rPr>
+        <w:t>①</w:t>
+      </w:r>
+      <w:r>
+        <w:rPr>
+          <w:rFonts w:ascii="Times New Roman" w:hAnsi="Times New Roman" w:cs="Times New Roman"/>
+          <w:b w:val="0"/>
+          <w:i w:val="0"/>
+          <w:sz w:val="26"/>
+        </w:rPr>
+        <w:t xml:space="preserve"> là 0,103 còn của Bộ B là 0,665 nên mức chênh 0,561 là lớn nhất trong 12 cặp; P@5 tăng từ 19% và 25% lên 96% và 91%, tức tăng 77 và 67 điểm, cũng là mức tăng lớn nhất trong 20 loài. Mạng sâu nhận ra đặc điểm phân biệt là số khoang trắng, thứ mà cả từ vựng ngữ nghĩa lẫn đặc trưng màu đều bỏ sót.</w:t>
       </w:r>
     </w:p>
     <w:p>
@@ -6481,7 +6094,7 @@
           <w:i w:val="0"/>
           <w:sz w:val="26"/>
         </w:rPr>
-        <w:t>Tóm lại, ba phương pháp cho ba kết luận trùng khớp:</w:t>
+        <w:t>Ba phương pháp cho ba kết luận trùng khớp:</w:t>
       </w:r>
     </w:p>
     <w:p>
@@ -6518,16 +6131,7 @@
           <w:i w:val="0"/>
           <w:sz w:val="26"/>
         </w:rPr>
-        <w:t xml:space="preserve">Loài có màu nâu, bạc, đen là loài khó; loài có màu rực hoặc màu riêng là loài dễ. </w:t>
-      </w:r>
-      <w:r>
-        <w:rPr>
-          <w:rFonts w:ascii="Times New Roman" w:hAnsi="Times New Roman" w:cs="Times New Roman"/>
-          <w:b/>
-          <w:i w:val="0"/>
-          <w:sz w:val="26"/>
-        </w:rPr>
-        <w:t>(entropy + P@5)</w:t>
+        <w:t>Loài có màu nâu, bạc hoặc đen là loài khó; loài có màu rực hoặc màu riêng là loài dễ (entropy và P@5).</w:t>
       </w:r>
     </w:p>
     <w:p>
@@ -6564,16 +6168,7 @@
           <w:i w:val="0"/>
           <w:sz w:val="26"/>
         </w:rPr>
-        <w:t xml:space="preserve">Cặp Oreochromis cùng chi là chỗ khó nhất, và khó với cả đặc trưng màu lẫn đặc trưng sâu. </w:t>
-      </w:r>
-      <w:r>
-        <w:rPr>
-          <w:rFonts w:ascii="Times New Roman" w:hAnsi="Times New Roman" w:cs="Times New Roman"/>
-          <w:b/>
-          <w:i w:val="0"/>
-          <w:sz w:val="26"/>
-        </w:rPr>
-        <w:t>(Fisher + P@5 + nhầm lẫn top-1)</w:t>
+        <w:t>Cặp Oreochromis cùng chi là điểm khó nhất, và khó với cả đặc trưng màu lẫn đặc trưng sâu (Fisher, P@5 và nhầm lẫn top-1).</w:t>
       </w:r>
     </w:p>
     <w:p>
@@ -6628,16 +6223,7 @@
           <w:i w:val="0"/>
           <w:sz w:val="26"/>
         </w:rPr>
-        <w:t xml:space="preserve"> nhiều nhất ở những cặp mà đặc điểm phân biệt là hoa văn chứ không phải màu. </w:t>
-      </w:r>
-      <w:r>
-        <w:rPr>
-          <w:rFonts w:ascii="Times New Roman" w:hAnsi="Times New Roman" w:cs="Times New Roman"/>
-          <w:b/>
-          <w:i w:val="0"/>
-          <w:sz w:val="26"/>
-        </w:rPr>
-        <w:t>(Fisher + P@5)</w:t>
+        <w:t xml:space="preserve"> nhiều nhất ở những cặp mà đặc điểm phân biệt là hoa văn chứ không phải màu (Fisher và P@5).</w:t>
       </w:r>
     </w:p>
     <w:p>
@@ -6684,56 +6270,11 @@
       <w:r>
         <w:rPr>
           <w:rFonts w:ascii="Times New Roman" w:hAnsi="Times New Roman" w:cs="Times New Roman"/>
-          <w:b/>
-          <w:i w:val="0"/>
-          <w:sz w:val="26"/>
-        </w:rPr>
-        <w:t>Mục 1 (Tóm tắt)</w:t>
-      </w:r>
-      <w:r>
-        <w:rPr>
-          <w:rFonts w:ascii="Times New Roman" w:hAnsi="Times New Roman" w:cs="Times New Roman"/>
           <w:b w:val="0"/>
           <w:i w:val="0"/>
           <w:sz w:val="26"/>
         </w:rPr>
-        <w:t xml:space="preserve"> — câu “kiem_tra.py --day-du (10/10 bộ kiểm thử đạt)” giờ sai vì đã thêm bộ kiểm thử fisher. Số đúng hiện tại là </w:t>
-      </w:r>
-      <w:r>
-        <w:rPr>
-          <w:rFonts w:ascii="Times New Roman" w:hAnsi="Times New Roman" w:cs="Times New Roman"/>
-          <w:b/>
-          <w:i w:val="0"/>
-          <w:sz w:val="26"/>
-        </w:rPr>
-        <w:t>8/8</w:t>
-      </w:r>
-      <w:r>
-        <w:rPr>
-          <w:rFonts w:ascii="Times New Roman" w:hAnsi="Times New Roman" w:cs="Times New Roman"/>
-          <w:b w:val="0"/>
-          <w:i w:val="0"/>
-          <w:sz w:val="26"/>
-        </w:rPr>
-        <w:t xml:space="preserve"> bộ cơ bản và </w:t>
-      </w:r>
-      <w:r>
-        <w:rPr>
-          <w:rFonts w:ascii="Times New Roman" w:hAnsi="Times New Roman" w:cs="Times New Roman"/>
-          <w:b/>
-          <w:i w:val="0"/>
-          <w:sz w:val="26"/>
-        </w:rPr>
-        <w:t>11/11</w:t>
-      </w:r>
-      <w:r>
-        <w:rPr>
-          <w:rFonts w:ascii="Times New Roman" w:hAnsi="Times New Roman" w:cs="Times New Roman"/>
-          <w:b w:val="0"/>
-          <w:i w:val="0"/>
-          <w:sz w:val="26"/>
-        </w:rPr>
-        <w:t xml:space="preserve"> khi chạy kèm --day-du.</w:t>
+        <w:t>Mục 1 Tóm tắt: câu “kiem_tra.py --day-du (10/10 bộ kiểm thử đạt)” không còn đúng vì nhóm đã thêm bộ kiểm thử fisher. Số đúng hiện tại là 8/8 bộ cơ bản và 11/11 khi chạy kèm --day-du.</w:t>
       </w:r>
     </w:p>
     <w:p>
@@ -6766,20 +6307,11 @@
       <w:r>
         <w:rPr>
           <w:rFonts w:ascii="Times New Roman" w:hAnsi="Times New Roman" w:cs="Times New Roman"/>
-          <w:b/>
-          <w:i w:val="0"/>
-          <w:sz w:val="26"/>
-        </w:rPr>
-        <w:t>Mục 3.4</w:t>
-      </w:r>
-      <w:r>
-        <w:rPr>
-          <w:rFonts w:ascii="Times New Roman" w:hAnsi="Times New Roman" w:cs="Times New Roman"/>
           <w:b w:val="0"/>
           <w:i w:val="0"/>
           <w:sz w:val="26"/>
         </w:rPr>
-        <w:t xml:space="preserve"> — câu “Bảng ba cột (nội lớp, liên lớp, tỉ số) trên mẫu cân bằng 19 ảnh mỗi loài sẽ được trình bày ở báo cáo tiến độ 2” cần bỏ, thay bằng “Bảng ba cột được trình bày ở mục 3.5”. Bảng đó đã có.</w:t>
+        <w:t>Mục 3.4: câu “Bảng ba cột (nội lớp, liên lớp, tỉ số) trên mẫu cân bằng 19 ảnh mỗi loài sẽ được trình bày ở báo cáo tiến độ 2” cần thay bằng “Bảng ba cột được trình bày ở mục 3.5”, vì bảng đó đã có.</w:t>
       </w:r>
     </w:p>
     <w:sectPr>

</xml_diff>